<commit_message>
Add network diagram, update report and assessment, add gitignore and Claude commands
Co-Authored-By: Claude Sonnet 4.6 <noreply@anthropic.com>
</commit_message>
<xml_diff>
--- a/Assessment_Task2_EC_FullMarks_Edited.docx
+++ b/Assessment_Task2_EC_FullMarks_Edited.docx
@@ -2702,7 +2702,7 @@
         <w:rPr>
           <w:noProof/>
         </w:rPr>
-        <w:pict w14:anchorId="30702E50">
+        <w:pict w14:anchorId="607591A4">
           <v:rect id="_x0000_i1025" alt="" style="width:451.3pt;height:.05pt;mso-width-percent:0;mso-height-percent:0;mso-width-percent:0;mso-height-percent:0" o:hralign="center" o:hrstd="t" o:hr="t" fillcolor="#a0a0a0" stroked="f"/>
         </w:pict>
       </w:r>
@@ -4329,11 +4329,15 @@
         <w:pStyle w:val="NormalWeb"/>
         <w:rPr>
           <w:rFonts w:ascii="Arial" w:hAnsi="Arial" w:cs="Arial"/>
-        </w:rPr>
-      </w:pPr>
-      <w:r>
-        <w:rPr>
-          <w:rFonts w:ascii="Arial" w:hAnsi="Arial" w:cs="Arial"/>
+          <w:sz w:val="22"/>
+          <w:szCs w:val="22"/>
+        </w:rPr>
+      </w:pPr>
+      <w:r>
+        <w:rPr>
+          <w:rFonts w:ascii="Arial" w:hAnsi="Arial" w:cs="Arial"/>
+          <w:sz w:val="22"/>
+          <w:szCs w:val="22"/>
         </w:rPr>
         <w:t>Several Australian laws and regulations apply to smart home networks.</w:t>
       </w:r>
@@ -4343,18 +4347,24 @@
         <w:pStyle w:val="NormalWeb"/>
         <w:rPr>
           <w:rFonts w:ascii="Arial" w:hAnsi="Arial" w:cs="Arial"/>
+          <w:sz w:val="22"/>
+          <w:szCs w:val="22"/>
         </w:rPr>
       </w:pPr>
       <w:r>
         <w:rPr>
           <w:rStyle w:val="Strong"/>
           <w:rFonts w:ascii="Arial" w:hAnsi="Arial" w:cs="Arial"/>
+          <w:sz w:val="22"/>
+          <w:szCs w:val="22"/>
         </w:rPr>
         <w:t>Privacy Act 1988 (Cth)</w:t>
       </w:r>
       <w:r>
         <w:rPr>
           <w:rFonts w:ascii="Arial" w:hAnsi="Arial" w:cs="Arial"/>
+          <w:sz w:val="22"/>
+          <w:szCs w:val="22"/>
         </w:rPr>
         <w:br/>
         <w:t>This law regulates how organisations collect, store, and manage personal information. Smart home providers that collect user data must ensure that personal information is handled securely and only used for authorised purposes.</w:t>
@@ -4365,12 +4375,16 @@
         <w:pStyle w:val="NormalWeb"/>
         <w:rPr>
           <w:rFonts w:ascii="Arial" w:hAnsi="Arial" w:cs="Arial"/>
+          <w:sz w:val="22"/>
+          <w:szCs w:val="22"/>
         </w:rPr>
       </w:pPr>
       <w:r>
         <w:rPr>
           <w:rStyle w:val="Strong"/>
           <w:rFonts w:ascii="Arial" w:hAnsi="Arial" w:cs="Arial"/>
+          <w:sz w:val="22"/>
+          <w:szCs w:val="22"/>
         </w:rPr>
         <w:lastRenderedPageBreak/>
         <w:t>Australian Privacy Principles (APPs)</w:t>
@@ -4378,6 +4392,8 @@
       <w:r>
         <w:rPr>
           <w:rFonts w:ascii="Arial" w:hAnsi="Arial" w:cs="Arial"/>
+          <w:sz w:val="22"/>
+          <w:szCs w:val="22"/>
         </w:rPr>
         <w:br/>
         <w:t>The Australian Privacy Principles require organisations to protect personal information from misuse, loss, unauthorised access, modification, or disclosure.</w:t>
@@ -4388,18 +4404,24 @@
         <w:pStyle w:val="NormalWeb"/>
         <w:rPr>
           <w:rFonts w:ascii="Arial" w:hAnsi="Arial" w:cs="Arial"/>
+          <w:sz w:val="22"/>
+          <w:szCs w:val="22"/>
         </w:rPr>
       </w:pPr>
       <w:r>
         <w:rPr>
           <w:rStyle w:val="Strong"/>
           <w:rFonts w:ascii="Arial" w:hAnsi="Arial" w:cs="Arial"/>
+          <w:sz w:val="22"/>
+          <w:szCs w:val="22"/>
         </w:rPr>
         <w:t>Consumer Law (Australian Consumer Law - ACL)</w:t>
       </w:r>
       <w:r>
         <w:rPr>
           <w:rFonts w:ascii="Arial" w:hAnsi="Arial" w:cs="Arial"/>
+          <w:sz w:val="22"/>
+          <w:szCs w:val="22"/>
         </w:rPr>
         <w:br/>
         <w:t>Smart home products must be safe, reliable, and perform as advertised. Consumers have rights to repairs, replacements, or refunds if products fail to meet acceptable standards.</w:t>
@@ -4410,11 +4432,15 @@
         <w:pStyle w:val="NormalWeb"/>
         <w:rPr>
           <w:rFonts w:ascii="Arial" w:hAnsi="Arial" w:cs="Arial"/>
-        </w:rPr>
-      </w:pPr>
-      <w:r>
-        <w:rPr>
-          <w:rFonts w:ascii="Arial" w:hAnsi="Arial" w:cs="Arial"/>
+          <w:sz w:val="22"/>
+          <w:szCs w:val="22"/>
+        </w:rPr>
+      </w:pPr>
+      <w:r>
+        <w:rPr>
+          <w:rFonts w:ascii="Arial" w:hAnsi="Arial" w:cs="Arial"/>
+          <w:sz w:val="22"/>
+          <w:szCs w:val="22"/>
         </w:rPr>
         <w:t>These laws help protect users and ensure that manufacturers and service providers are responsible for securing personal information collected through smart home technologies.</w:t>
       </w:r>
@@ -4438,313 +4464,39 @@
         <w:spacing w:after="40"/>
       </w:pPr>
       <w:r>
-        <w:t>My new smart home design is a significant improvement over the original network because it provides better speed, safety, accessibility, and smart control.</w:t>
-      </w:r>
-      <w:r>
-        <w:t xml:space="preserve"> The original network experienced issues such as weak Wi-Fi coverage in the master bedroom, random device dropouts, and a lack of smart devices. By </w:t>
-      </w:r>
-      <w:r>
-        <w:t>introduce</w:t>
-      </w:r>
-      <w:r>
-        <w:t>x</w:t>
-      </w:r>
-    </w:p>
-    <w:p>
-      <w:pPr>
-        <w:spacing w:after="40"/>
-      </w:pPr>
-    </w:p>
-    <w:p>
-      <w:pPr>
-        <w:spacing w:after="40"/>
-      </w:pPr>
-      <w:r>
-        <w:t xml:space="preserve">The updated design makes the network faster due to improved Wi-Fi performance thanks to the star network topology and the presence of Wi-Fi booster. It guarantees better connection and more stability when using smart devices that should be connected to the network. All the mentioned smart security cameras, smart lights, smart door lock, smart watches, health monitors, and other devices </w:t>
-      </w:r>
-      <w:r>
-        <w:t>can</w:t>
-      </w:r>
-      <w:r>
-        <w:t xml:space="preserve"> work in sync with no connection difficulties at all.</w:t>
-      </w:r>
-    </w:p>
-    <w:p>
-      <w:pPr>
-        <w:spacing w:after="40"/>
-      </w:pPr>
-    </w:p>
-    <w:p>
-      <w:pPr>
-        <w:spacing w:after="40"/>
-      </w:pPr>
-      <w:r>
-        <w:t>Furthermore, the smart home design is safer since it includes smart security cameras, smart door lock, and additional protection measures in terms of network configuration. The updated design is protected against any cyber threats with WPA3 encryption, firewall, two-factor authentication, and guest network features. All the security solutions mentioned above provide homeowners with higher data security and better privacy.</w:t>
-      </w:r>
-    </w:p>
-    <w:p>
-      <w:pPr>
-        <w:spacing w:after="40"/>
-      </w:pPr>
-    </w:p>
-    <w:p>
-      <w:pPr>
-        <w:spacing w:after="40"/>
-      </w:pPr>
-    </w:p>
-    <w:p>
-      <w:pPr>
-        <w:spacing w:after="40"/>
-      </w:pPr>
-    </w:p>
-    <w:p>
-      <w:pPr>
-        <w:spacing w:after="40"/>
-      </w:pPr>
-    </w:p>
-    <w:p>
-      <w:pPr>
-        <w:spacing w:after="40"/>
-      </w:pPr>
-    </w:p>
-    <w:p>
-      <w:pPr>
-        <w:spacing w:after="40"/>
-      </w:pPr>
-    </w:p>
-    <w:p>
-      <w:r>
-        <w:br w:type="page"/>
-      </w:r>
-    </w:p>
-    <w:p>
-      <w:r>
-        <w:lastRenderedPageBreak/>
-        <w:br w:type="page"/>
-      </w:r>
-    </w:p>
-    <w:p>
-      <w:pPr>
-        <w:pStyle w:val="Heading1"/>
-      </w:pPr>
-      <w:r>
-        <w:lastRenderedPageBreak/>
-        <w:t>Teacher Improvement Additions (Full-Mark Version)</w:t>
-      </w:r>
-    </w:p>
-    <w:p>
-      <w:pPr>
-        <w:pStyle w:val="Heading2"/>
-      </w:pPr>
-      <w:r>
-        <w:t>Project Management</w:t>
-      </w:r>
-    </w:p>
-    <w:p>
-      <w:r>
-        <w:t>To ensure the successful completion of this smart home network project, project management tools were used to plan, monitor, and organise tasks throughout the design process.</w:t>
+        <w:t>My new smart home network design is a significant improvement over the original network because it provides greater speed, reliability, security, accessibility, and smart functionality.</w:t>
       </w:r>
       <w:r>
         <w:br/>
       </w:r>
       <w:r>
         <w:br/>
-        <w:t>Project Stages:</w:t>
+        <w:t>The redesigned network solves the original problems of weak Wi</w:t>
+      </w:r>
+      <w:r>
+        <w:rPr>
+          <w:rFonts w:ascii="Cambria Math" w:hAnsi="Cambria Math" w:cs="Cambria Math"/>
+        </w:rPr>
+        <w:t>‑</w:t>
+      </w:r>
+      <w:r>
+        <w:t>Fi coverage, device dropouts, and limited functionality by introducing a hybrid wired and wireless architecture based on a star topology. Wired Ethernet connections provide high-speed performance, while wireless connectivity allows flexibility for smart devices throughout the home.</w:t>
       </w:r>
       <w:r>
         <w:br/>
-        <w:t>1. Investigation of current home network</w:t>
       </w:r>
       <w:r>
         <w:br/>
-        <w:t>2. Identification of network issues</w:t>
-      </w:r>
-      <w:r>
-        <w:br/>
-        <w:t>3. Research into smart home technologies</w:t>
-      </w:r>
-      <w:r>
-        <w:br/>
-        <w:t>4. Design of the new smart home network</w:t>
-      </w:r>
-      <w:r>
-        <w:br/>
-        <w:t>5. Creation of network diagrams</w:t>
-      </w:r>
-      <w:r>
-        <w:br/>
-        <w:t>6. Cisco Packet Tracer simulation</w:t>
-      </w:r>
-      <w:r>
-        <w:br/>
-        <w:t>7. Research into cloud, edge computing, AI, IoT and IoMe</w:t>
-      </w:r>
-      <w:r>
-        <w:br/>
-        <w:t>8. Security planning</w:t>
-      </w:r>
-      <w:r>
-        <w:br/>
-      </w:r>
-      <w:r>
-        <w:t>9. Social, ethical and legal analysis</w:t>
-      </w:r>
-      <w:r>
-        <w:br/>
-        <w:t>10. Final report preparation</w:t>
-      </w:r>
-      <w:r>
-        <w:br/>
-      </w:r>
-      <w:r>
-        <w:br/>
-        <w:t>Gantt Chart:</w:t>
-      </w:r>
-      <w:r>
-        <w:br/>
-        <w:t>[Insert Gantt Chart Here]</w:t>
-      </w:r>
-      <w:r>
-        <w:br/>
-      </w:r>
-    </w:p>
-    <w:p>
-      <w:pPr>
-        <w:pStyle w:val="Heading2"/>
-      </w:pPr>
-      <w:r>
-        <w:t>Simulation Testing Results</w:t>
-      </w:r>
-    </w:p>
-    <w:p>
-      <w:r>
-        <w:t>The Cisco Packet Tracer simulation was configured using a star topology with the wireless router acting as the central device.</w:t>
-      </w:r>
-      <w:r>
-        <w:br/>
-      </w:r>
-      <w:r>
-        <w:br/>
-        <w:t>• All devices obtained valid IP addresses through DHCP.</w:t>
-      </w:r>
-      <w:r>
-        <w:br/>
-        <w:t>• PCs connected successfully to the router through the switch.</w:t>
-      </w:r>
-      <w:r>
-        <w:br/>
-        <w:t>• Wireless devices connected successfully to the Wi‑Fi network.</w:t>
-      </w:r>
-      <w:r>
-        <w:br/>
-        <w:t>• Smart devices were able to communicate with each other.</w:t>
-      </w:r>
-      <w:r>
-        <w:br/>
-      </w:r>
-      <w:r>
-        <w:t>• Ping tests confirmed successful communication between wired and wireless devices.</w:t>
-      </w:r>
-      <w:r>
-        <w:br/>
-        <w:t>• Internet connectivity was verified for all devices.</w:t>
-      </w:r>
-      <w:r>
-        <w:br/>
-        <w:t>• WPA3 wireless security settings were configured.</w:t>
-      </w:r>
-      <w:r>
-        <w:br/>
-        <w:t>• The guest network was isolated from the main smart home network.</w:t>
-      </w:r>
-      <w:r>
-        <w:br/>
-      </w:r>
-      <w:r>
-        <w:br/>
-        <w:t>The successful simulation demonstrates that the proposed smart home network design is functional, secure, scalable, and capable of supporting IoT and IoMe devices.</w:t>
-      </w:r>
-      <w:r>
-        <w:br/>
-      </w:r>
-    </w:p>
-    <w:p>
-      <w:pPr>
-        <w:pStyle w:val="Heading2"/>
-      </w:pPr>
-      <w:r>
-        <w:t>Relevant Australian Laws</w:t>
-      </w:r>
-    </w:p>
-    <w:p>
-      <w:r>
-        <w:t>Privacy Act 1988 (Cth)</w:t>
-      </w:r>
-      <w:r>
-        <w:br/>
-      </w:r>
-      <w:r>
-        <w:t>This law regulates how organisations collect, store, and manage personal information.</w:t>
-      </w:r>
-      <w:r>
-        <w:br/>
-      </w:r>
-      <w:r>
-        <w:br/>
-        <w:t>Australian Privacy Principles (APPs)</w:t>
-      </w:r>
-      <w:r>
-        <w:br/>
-        <w:t>These principles require organisations to protect personal information from misuse, loss, unauthorised access, modification, or disclosure.</w:t>
-      </w:r>
-      <w:r>
-        <w:br/>
-      </w:r>
-      <w:r>
-        <w:br/>
-        <w:t>Australian Consumer Law (ACL)</w:t>
-      </w:r>
-      <w:r>
-        <w:br/>
-        <w:t>Smart home products must be safe, reliable, and perform as advertised.</w:t>
-      </w:r>
-      <w:r>
-        <w:br/>
-      </w:r>
-    </w:p>
-    <w:p>
-      <w:pPr>
-        <w:pStyle w:val="Heading2"/>
-      </w:pPr>
-      <w:r>
-        <w:t>Replacement Conclusion – Why This Design Works</w:t>
-      </w:r>
-    </w:p>
-    <w:p>
-      <w:r>
-        <w:t>My new smart home network design is a significant improvement over the original network because it provides greater speed, reliability, security, accessibility, and smart functionality.</w:t>
-      </w:r>
-      <w:r>
-        <w:br/>
-      </w:r>
-      <w:r>
-        <w:br/>
-      </w:r>
-      <w:r>
-        <w:t xml:space="preserve">The redesigned network solves the original problems of weak Wi‑Fi coverage, device dropouts, and </w:t>
-      </w:r>
-      <w:r>
-        <w:lastRenderedPageBreak/>
-        <w:t>limited functionality by introducing a hybrid wired and wireless architecture based on a star topology. Wired Ethernet connections provide high-speed performance, while wireless connectivity allows flexibility for smart devices throughout the home.</w:t>
-      </w:r>
-      <w:r>
-        <w:br/>
-      </w:r>
-      <w:r>
-        <w:br/>
-      </w:r>
-      <w:r>
-        <w:t>The addition of a Wi‑Fi booster improves signal coverage and eliminates dead zones. Smart security cameras, smart door locks, smart lights, smart watches, and health monitors operate reliably across the network.</w:t>
+        <w:t>The addition of a Wi</w:t>
+      </w:r>
+      <w:r>
+        <w:rPr>
+          <w:rFonts w:ascii="Cambria Math" w:hAnsi="Cambria Math" w:cs="Cambria Math"/>
+        </w:rPr>
+        <w:t>‑</w:t>
+      </w:r>
+      <w:r>
+        <w:t>Fi booster improves signal coverage and eliminates dead zones. Smart security cameras, smart door locks, smart lights, smart watches, and health monitors operate reliably across the network.</w:t>
       </w:r>
       <w:r>
         <w:br/>
@@ -4758,8 +4510,6 @@
       </w:r>
       <w:r>
         <w:br/>
-      </w:r>
-      <w:r>
         <w:t>Cloud computing provides secure storage, remote access, backups, and data analysis, while edge computing enables immediate responses for smart lighting, door lock control, and motion detection. Together these technologies improve efficiency and reduce latency.</w:t>
       </w:r>
       <w:r>
@@ -4768,9 +4518,6 @@
       <w:r>
         <w:br/>
         <w:t>Overall, this design provides a fast, secure, scalable, and intelligent smart home network that supports convenience, safety, efficiency, and future expansion.</w:t>
-      </w:r>
-      <w:r>
-        <w:br/>
       </w:r>
     </w:p>
     <w:sectPr>

</xml_diff>